<commit_message>
docs(report): add verified Git commit history
</commit_message>
<xml_diff>
--- a/docs/Informe_Laboratorio_1_ESP32.docx
+++ b/docs/Informe_Laboratorio_1_ESP32.docx
@@ -72,7 +72,7 @@
           <w:lang w:val="en-US"/>
         </w:rPr>
         <w:drawing>
-          <wp:inline distT="0" distB="0" distL="0" distR="0" wp14:anchorId="06ADF4E0" wp14:editId="4CE7049D">
+          <wp:inline distT="0" distB="0" distL="0" distR="0" wp14:anchorId="11A89975" wp14:editId="0C13E0B8">
             <wp:extent cx="1743075" cy="2133600"/>
             <wp:effectExtent l="0" t="0" r="9525" b="0"/>
             <wp:docPr id="16" name="Imagen 16"/>
@@ -362,20 +362,6 @@
     </w:p>
     <w:p>
       <w:pPr>
-        <w:pStyle w:val="Ttulo"/>
-        <w:rPr>
-          <w:rFonts w:ascii="Arial" w:hAnsi="Arial"/>
-        </w:rPr>
-      </w:pPr>
-      <w:r>
-        <w:rPr>
-          <w:rFonts w:ascii="Arial" w:hAnsi="Arial"/>
-        </w:rPr>
-        <w:br/>
-      </w:r>
-    </w:p>
-    <w:p>
-      <w:pPr>
         <w:spacing w:after="200" w:line="276" w:lineRule="auto"/>
         <w:rPr>
           <w:rFonts w:eastAsiaTheme="majorEastAsia" w:cstheme="majorBidi"/>
@@ -841,12 +827,9 @@
         <w:jc w:val="center"/>
       </w:pPr>
       <w:r>
-        <w:rPr>
-          <w:noProof/>
-        </w:rPr>
         <w:lastRenderedPageBreak/>
         <w:drawing>
-          <wp:inline distT="0" distB="0" distL="0" distR="0" wp14:anchorId="44C8F9BF" wp14:editId="6D21DB44">
+          <wp:inline distT="0" distB="0" distL="0" distR="0" wp14:anchorId="0394FAF8" wp14:editId="056CA682">
             <wp:extent cx="5760000" cy="2468122"/>
             <wp:effectExtent l="0" t="0" r="0" b="0"/>
             <wp:docPr id="1" name="Picture 1"/>
@@ -897,11 +880,8 @@
         <w:jc w:val="center"/>
       </w:pPr>
       <w:r>
-        <w:rPr>
-          <w:noProof/>
-        </w:rPr>
         <w:drawing>
-          <wp:inline distT="0" distB="0" distL="0" distR="0" wp14:anchorId="46E5B976" wp14:editId="7608C426">
+          <wp:inline distT="0" distB="0" distL="0" distR="0" wp14:anchorId="343C755C" wp14:editId="0E6F23BD">
             <wp:extent cx="5760000" cy="2722795"/>
             <wp:effectExtent l="0" t="0" r="0" b="0"/>
             <wp:docPr id="2" name="Picture 2"/>
@@ -1354,7 +1334,15 @@
         <w:ind w:left="227"/>
       </w:pPr>
       <w:r>
-        <w:t xml:space="preserve">  "node_id": "ESP32_LUZ_01",</w:t>
+        <w:t xml:space="preserve">  "</w:t>
+      </w:r>
+      <w:proofErr w:type="spellStart"/>
+      <w:r>
+        <w:t>node_id</w:t>
+      </w:r>
+      <w:proofErr w:type="spellEnd"/>
+      <w:r>
+        <w:t>": "ESP32_LUZ_01",</w:t>
       </w:r>
     </w:p>
     <w:p>
@@ -1399,7 +1387,15 @@
         <w:ind w:left="227"/>
       </w:pPr>
       <w:r>
-        <w:t xml:space="preserve">  "rssi": -60,</w:t>
+        <w:t xml:space="preserve">  "</w:t>
+      </w:r>
+      <w:proofErr w:type="spellStart"/>
+      <w:r>
+        <w:t>rssi</w:t>
+      </w:r>
+      <w:proofErr w:type="spellEnd"/>
+      <w:r>
+        <w:t>": -60,</w:t>
       </w:r>
     </w:p>
     <w:p>
@@ -1408,7 +1404,15 @@
         <w:ind w:left="227"/>
       </w:pPr>
       <w:r>
-        <w:t xml:space="preserve">  "uptime_ms": 12345,</w:t>
+        <w:t xml:space="preserve">  "</w:t>
+      </w:r>
+      <w:proofErr w:type="spellStart"/>
+      <w:r>
+        <w:t>uptime_ms</w:t>
+      </w:r>
+      <w:proofErr w:type="spellEnd"/>
+      <w:r>
+        <w:t>": 12345,</w:t>
       </w:r>
     </w:p>
     <w:p>
@@ -1417,7 +1421,15 @@
         <w:ind w:left="227"/>
       </w:pPr>
       <w:r>
-        <w:t xml:space="preserve">  "rele": 1,</w:t>
+        <w:t xml:space="preserve">  "</w:t>
+      </w:r>
+      <w:proofErr w:type="spellStart"/>
+      <w:r>
+        <w:t>rele</w:t>
+      </w:r>
+      <w:proofErr w:type="spellEnd"/>
+      <w:r>
+        <w:t>": 1,</w:t>
       </w:r>
     </w:p>
     <w:p>
@@ -1426,7 +1438,15 @@
         <w:ind w:left="227"/>
       </w:pPr>
       <w:r>
-        <w:t xml:space="preserve">  "led_verde": 1,</w:t>
+        <w:t xml:space="preserve">  "</w:t>
+      </w:r>
+      <w:proofErr w:type="spellStart"/>
+      <w:r>
+        <w:t>led_verde</w:t>
+      </w:r>
+      <w:proofErr w:type="spellEnd"/>
+      <w:r>
+        <w:t>": 1,</w:t>
       </w:r>
     </w:p>
     <w:p>
@@ -1435,7 +1455,15 @@
         <w:ind w:left="227"/>
       </w:pPr>
       <w:r>
-        <w:t xml:space="preserve">  "led_rojo": 0</w:t>
+        <w:t xml:space="preserve">  "</w:t>
+      </w:r>
+      <w:proofErr w:type="spellStart"/>
+      <w:r>
+        <w:t>led_rojo</w:t>
+      </w:r>
+      <w:proofErr w:type="spellEnd"/>
+      <w:r>
+        <w:t>": 0</w:t>
       </w:r>
     </w:p>
     <w:p>
@@ -1836,12 +1864,9 @@
         <w:jc w:val="center"/>
       </w:pPr>
       <w:r>
-        <w:rPr>
-          <w:noProof/>
-        </w:rPr>
         <w:lastRenderedPageBreak/>
         <w:drawing>
-          <wp:inline distT="0" distB="0" distL="0" distR="0" wp14:anchorId="4959CF4E" wp14:editId="1572B396">
+          <wp:inline distT="0" distB="0" distL="0" distR="0" wp14:anchorId="58BAD0EA" wp14:editId="11ED973F">
             <wp:extent cx="5760000" cy="3306588"/>
             <wp:effectExtent l="0" t="0" r="0" b="0"/>
             <wp:docPr id="3" name="Picture 3"/>
@@ -2816,11 +2841,8 @@
         <w:jc w:val="center"/>
       </w:pPr>
       <w:r>
-        <w:rPr>
-          <w:noProof/>
-        </w:rPr>
         <w:drawing>
-          <wp:inline distT="0" distB="0" distL="0" distR="0" wp14:anchorId="6C604992" wp14:editId="44F35C33">
+          <wp:inline distT="0" distB="0" distL="0" distR="0" wp14:anchorId="62D0177D" wp14:editId="6421FAD0">
             <wp:extent cx="5760000" cy="2384819"/>
             <wp:effectExtent l="0" t="0" r="0" b="0"/>
             <wp:docPr id="4" name="Picture 4"/>
@@ -3311,12 +3333,9 @@
         <w:jc w:val="center"/>
       </w:pPr>
       <w:r>
-        <w:rPr>
-          <w:noProof/>
-        </w:rPr>
         <w:lastRenderedPageBreak/>
         <w:drawing>
-          <wp:inline distT="0" distB="0" distL="0" distR="0" wp14:anchorId="4724FB9A" wp14:editId="70D50C13">
+          <wp:inline distT="0" distB="0" distL="0" distR="0" wp14:anchorId="069FE6B1" wp14:editId="3F61C1B5">
             <wp:extent cx="5760000" cy="2252329"/>
             <wp:effectExtent l="0" t="0" r="0" b="0"/>
             <wp:docPr id="5" name="Picture 5"/>
@@ -3581,11 +3600,8 @@
         <w:jc w:val="center"/>
       </w:pPr>
       <w:r>
-        <w:rPr>
-          <w:noProof/>
-        </w:rPr>
         <w:drawing>
-          <wp:inline distT="0" distB="0" distL="0" distR="0" wp14:anchorId="383D1988" wp14:editId="1B094E26">
+          <wp:inline distT="0" distB="0" distL="0" distR="0" wp14:anchorId="24511971" wp14:editId="5649D1FA">
             <wp:extent cx="5040000" cy="1932632"/>
             <wp:effectExtent l="0" t="0" r="0" b="0"/>
             <wp:docPr id="6" name="Picture 6"/>
@@ -3878,11 +3894,8 @@
         <w:jc w:val="center"/>
       </w:pPr>
       <w:r>
-        <w:rPr>
-          <w:noProof/>
-        </w:rPr>
         <w:drawing>
-          <wp:inline distT="0" distB="0" distL="0" distR="0" wp14:anchorId="4F07D62E" wp14:editId="7AB07C66">
+          <wp:inline distT="0" distB="0" distL="0" distR="0" wp14:anchorId="69093A10" wp14:editId="22055447">
             <wp:extent cx="5508000" cy="2163218"/>
             <wp:effectExtent l="0" t="0" r="0" b="0"/>
             <wp:docPr id="14" name="Picture 14"/>
@@ -4216,11 +4229,8 @@
         <w:jc w:val="center"/>
       </w:pPr>
       <w:r>
-        <w:rPr>
-          <w:noProof/>
-        </w:rPr>
         <w:drawing>
-          <wp:inline distT="0" distB="0" distL="0" distR="0" wp14:anchorId="5FA13F27" wp14:editId="48009CCD">
+          <wp:inline distT="0" distB="0" distL="0" distR="0" wp14:anchorId="417EE0D0" wp14:editId="3B836E2B">
             <wp:extent cx="5760000" cy="2318574"/>
             <wp:effectExtent l="0" t="0" r="0" b="0"/>
             <wp:docPr id="7" name="Picture 7"/>
@@ -4961,11 +4971,519 @@
           </w:p>
         </w:tc>
       </w:tr>
+      <w:tr>
+        <w:trPr>
+          <w:jc w:val="center"/>
+        </w:trPr>
+        <w:tc>
+          <w:tcPr>
+            <w:tcW w:w="3128" w:type="dxa"/>
+            <w:vAlign w:val="center"/>
+          </w:tcPr>
+          <w:p>
+            <w:r>
+              <w:rPr>
+                <w:sz w:val="16"/>
+              </w:rPr>
+              <w:t>Repositorio e historial Git</w:t>
+            </w:r>
+          </w:p>
+        </w:tc>
+        <w:tc>
+          <w:tcPr>
+            <w:tcW w:w="3128" w:type="dxa"/>
+            <w:vAlign w:val="center"/>
+          </w:tcPr>
+          <w:p>
+            <w:r>
+              <w:rPr>
+                <w:sz w:val="16"/>
+              </w:rPr>
+              <w:t>github.com/jmamanilari-cyber/lab1-iot-node</w:t>
+            </w:r>
+          </w:p>
+        </w:tc>
+        <w:tc>
+          <w:tcPr>
+            <w:tcW w:w="3128" w:type="dxa"/>
+            <w:vAlign w:val="center"/>
+          </w:tcPr>
+          <w:p>
+            <w:r>
+              <w:rPr>
+                <w:sz w:val="16"/>
+              </w:rPr>
+              <w:t>Rama main; relación de commits en la sección 10.1.</w:t>
+            </w:r>
+          </w:p>
+        </w:tc>
+      </w:tr>
     </w:tbl>
     <w:p/>
     <w:p>
       <w:r>
         <w:t>Trazabilidad del entregable: se vinculan requisitos, implementación, métricas y ADR-01. La nueva evidencia de C corresponde a evidence/C_nueva_05/: log serial, eventos, resultados por ciclo, archivos del receptor y reporte de verificación. Los 30 intervalos Wi-Fi proceden de eventos registrados por el ESP32.</w:t>
+      </w:r>
+    </w:p>
+    <w:p>
+      <w:pPr>
+        <w:pStyle w:val="Ttulo2"/>
+      </w:pPr>
+      <w:r>
+        <w:rPr>
+          <w:rFonts w:ascii="Arial" w:hAnsi="Arial"/>
+        </w:rPr>
+        <w:t>10.1 Historial de commits del repositorio</w:t>
+      </w:r>
+    </w:p>
+    <w:p>
+      <w:pPr>
+        <w:spacing w:after="80"/>
+      </w:pPr>
+      <w:r>
+        <w:rPr>
+          <w:sz w:val="18"/>
+        </w:rPr>
+        <w:t>El código, los registros experimentales y la documentación se encuentran publicados en la rama main del repositorio lab1-iot-node. El historial de GitHub registra 26 commits, incluidos los seis commits más recientes que incorporan la actualización del firmware, los servicios, las evidencias y el informe.</w:t>
+      </w:r>
+    </w:p>
+    <w:p>
+      <w:pPr>
+        <w:spacing w:after="80"/>
+      </w:pPr>
+      <w:r>
+        <w:rPr>
+          <w:sz w:val="18"/>
+        </w:rPr>
+        <w:t>Repositorio: https://github.com/jmamanilari-cyber/lab1-iot-node</w:t>
+      </w:r>
+    </w:p>
+    <w:p>
+      <w:pPr>
+        <w:spacing w:after="80"/>
+      </w:pPr>
+      <w:r>
+        <w:rPr>
+          <w:sz w:val="18"/>
+        </w:rPr>
+        <w:t>Historial consultable: https://github.com/jmamanilari-cyber/lab1-iot-node/commits/main/</w:t>
+      </w:r>
+    </w:p>
+    <w:tbl>
+      <w:tblPr>
+        <w:tblStyle w:val="Tablaconcuadrcula"/>
+        <w:tblW w:w="0" w:type="auto"/>
+        <w:jc w:val="center"/>
+        <w:tblLayout w:type="fixed"/>
+        <w:tblLook w:val="04A0" w:firstRow="1" w:lastRow="0" w:firstColumn="1" w:lastColumn="0" w:noHBand="0" w:noVBand="1"/>
+      </w:tblPr>
+      <w:tblGrid>
+        <w:gridCol w:w="1077"/>
+        <w:gridCol w:w="4706"/>
+        <w:gridCol w:w="2835"/>
+      </w:tblGrid>
+      <w:tr>
+        <w:trPr>
+          <w:jc w:val="center"/>
+        </w:trPr>
+        <w:tc>
+          <w:tcPr>
+            <w:tcW w:w="1077" w:type="dxa"/>
+            <w:vAlign w:val="center"/>
+          </w:tcPr>
+          <w:p>
+            <w:pPr>
+              <w:spacing w:after="0"/>
+            </w:pPr>
+            <w:r>
+              <w:rPr>
+                <w:sz w:val="16"/>
+              </w:rPr>
+              <w:t>Commit</w:t>
+            </w:r>
+          </w:p>
+        </w:tc>
+        <w:tc>
+          <w:tcPr>
+            <w:tcW w:w="4706" w:type="dxa"/>
+            <w:vAlign w:val="center"/>
+          </w:tcPr>
+          <w:p>
+            <w:pPr>
+              <w:spacing w:after="0"/>
+            </w:pPr>
+            <w:r>
+              <w:rPr>
+                <w:sz w:val="16"/>
+              </w:rPr>
+              <w:t>Mensaje</w:t>
+            </w:r>
+          </w:p>
+        </w:tc>
+        <w:tc>
+          <w:tcPr>
+            <w:tcW w:w="2835" w:type="dxa"/>
+            <w:vAlign w:val="center"/>
+          </w:tcPr>
+          <w:p>
+            <w:pPr>
+              <w:spacing w:after="0"/>
+            </w:pPr>
+            <w:r>
+              <w:rPr>
+                <w:sz w:val="16"/>
+              </w:rPr>
+              <w:t>Contenido de la actualización</w:t>
+            </w:r>
+          </w:p>
+        </w:tc>
+      </w:tr>
+      <w:tr>
+        <w:trPr>
+          <w:jc w:val="center"/>
+        </w:trPr>
+        <w:tc>
+          <w:tcPr>
+            <w:tcW w:w="1077" w:type="dxa"/>
+            <w:vAlign w:val="center"/>
+          </w:tcPr>
+          <w:p>
+            <w:pPr>
+              <w:spacing w:after="0"/>
+            </w:pPr>
+            <w:r>
+              <w:rPr>
+                <w:sz w:val="16"/>
+              </w:rPr>
+              <w:t>56d86a7</w:t>
+            </w:r>
+          </w:p>
+        </w:tc>
+        <w:tc>
+          <w:tcPr>
+            <w:tcW w:w="4706" w:type="dxa"/>
+            <w:vAlign w:val="center"/>
+          </w:tcPr>
+          <w:p>
+            <w:pPr>
+              <w:spacing w:after="0"/>
+            </w:pPr>
+            <w:r>
+              <w:rPr>
+                <w:sz w:val="16"/>
+              </w:rPr>
+              <w:t>refactor(firmware): update existing experiment sketches</w:t>
+            </w:r>
+          </w:p>
+        </w:tc>
+        <w:tc>
+          <w:tcPr>
+            <w:tcW w:w="2835" w:type="dxa"/>
+            <w:vAlign w:val="center"/>
+          </w:tcPr>
+          <w:p>
+            <w:pPr>
+              <w:spacing w:after="0"/>
+            </w:pPr>
+            <w:r>
+              <w:rPr>
+                <w:sz w:val="16"/>
+              </w:rPr>
+              <w:t>Actualización de los sketches A–D.</w:t>
+            </w:r>
+          </w:p>
+        </w:tc>
+      </w:tr>
+      <w:tr>
+        <w:trPr>
+          <w:jc w:val="center"/>
+        </w:trPr>
+        <w:tc>
+          <w:tcPr>
+            <w:tcW w:w="1077" w:type="dxa"/>
+            <w:vAlign w:val="center"/>
+          </w:tcPr>
+          <w:p>
+            <w:pPr>
+              <w:spacing w:after="0"/>
+            </w:pPr>
+            <w:r>
+              <w:rPr>
+                <w:sz w:val="16"/>
+              </w:rPr>
+              <w:t>e54e417</w:t>
+            </w:r>
+          </w:p>
+        </w:tc>
+        <w:tc>
+          <w:tcPr>
+            <w:tcW w:w="4706" w:type="dxa"/>
+            <w:vAlign w:val="center"/>
+          </w:tcPr>
+          <w:p>
+            <w:pPr>
+              <w:spacing w:after="0"/>
+            </w:pPr>
+            <w:r>
+              <w:rPr>
+                <w:sz w:val="16"/>
+              </w:rPr>
+              <w:t>feat(wifi): add instrumented connection recovery experiment</w:t>
+            </w:r>
+          </w:p>
+        </w:tc>
+        <w:tc>
+          <w:tcPr>
+            <w:tcW w:w="2835" w:type="dxa"/>
+            <w:vAlign w:val="center"/>
+          </w:tcPr>
+          <w:p>
+            <w:pPr>
+              <w:spacing w:after="0"/>
+            </w:pPr>
+            <w:r>
+              <w:rPr>
+                <w:sz w:val="16"/>
+              </w:rPr>
+              <w:t>Instrumentación del experimento C.</w:t>
+            </w:r>
+          </w:p>
+        </w:tc>
+      </w:tr>
+      <w:tr>
+        <w:trPr>
+          <w:jc w:val="center"/>
+        </w:trPr>
+        <w:tc>
+          <w:tcPr>
+            <w:tcW w:w="1077" w:type="dxa"/>
+            <w:vAlign w:val="center"/>
+          </w:tcPr>
+          <w:p>
+            <w:pPr>
+              <w:spacing w:after="0"/>
+            </w:pPr>
+            <w:r>
+              <w:rPr>
+                <w:sz w:val="16"/>
+              </w:rPr>
+              <w:t>b6a1636</w:t>
+            </w:r>
+          </w:p>
+        </w:tc>
+        <w:tc>
+          <w:tcPr>
+            <w:tcW w:w="4706" w:type="dxa"/>
+            <w:vAlign w:val="center"/>
+          </w:tcPr>
+          <w:p>
+            <w:pPr>
+              <w:spacing w:after="0"/>
+            </w:pPr>
+            <w:r>
+              <w:rPr>
+                <w:sz w:val="16"/>
+              </w:rPr>
+              <w:t>feat(services): add MQTT capture and verification tools</w:t>
+            </w:r>
+          </w:p>
+        </w:tc>
+        <w:tc>
+          <w:tcPr>
+            <w:tcW w:w="2835" w:type="dxa"/>
+            <w:vAlign w:val="center"/>
+          </w:tcPr>
+          <w:p>
+            <w:pPr>
+              <w:spacing w:after="0"/>
+            </w:pPr>
+            <w:r>
+              <w:rPr>
+                <w:sz w:val="16"/>
+              </w:rPr>
+              <w:t>Servicios de captura y verificación.</w:t>
+            </w:r>
+          </w:p>
+        </w:tc>
+      </w:tr>
+      <w:tr>
+        <w:trPr>
+          <w:jc w:val="center"/>
+        </w:trPr>
+        <w:tc>
+          <w:tcPr>
+            <w:tcW w:w="1077" w:type="dxa"/>
+            <w:vAlign w:val="center"/>
+          </w:tcPr>
+          <w:p>
+            <w:pPr>
+              <w:spacing w:after="0"/>
+            </w:pPr>
+            <w:r>
+              <w:rPr>
+                <w:sz w:val="16"/>
+              </w:rPr>
+              <w:t>36da068</w:t>
+            </w:r>
+          </w:p>
+        </w:tc>
+        <w:tc>
+          <w:tcPr>
+            <w:tcW w:w="4706" w:type="dxa"/>
+            <w:vAlign w:val="center"/>
+          </w:tcPr>
+          <w:p>
+            <w:pPr>
+              <w:spacing w:after="0"/>
+            </w:pPr>
+            <w:r>
+              <w:rPr>
+                <w:sz w:val="16"/>
+              </w:rPr>
+              <w:t>test(evidence): update experiment captures and Wi-Fi recovery logs</w:t>
+            </w:r>
+          </w:p>
+        </w:tc>
+        <w:tc>
+          <w:tcPr>
+            <w:tcW w:w="2835" w:type="dxa"/>
+            <w:vAlign w:val="center"/>
+          </w:tcPr>
+          <w:p>
+            <w:pPr>
+              <w:spacing w:after="0"/>
+            </w:pPr>
+            <w:r>
+              <w:rPr>
+                <w:sz w:val="16"/>
+              </w:rPr>
+              <w:t>Capturas y registros de recuperación.</w:t>
+            </w:r>
+          </w:p>
+        </w:tc>
+      </w:tr>
+      <w:tr>
+        <w:trPr>
+          <w:jc w:val="center"/>
+        </w:trPr>
+        <w:tc>
+          <w:tcPr>
+            <w:tcW w:w="1077" w:type="dxa"/>
+            <w:vAlign w:val="center"/>
+          </w:tcPr>
+          <w:p>
+            <w:pPr>
+              <w:spacing w:after="0"/>
+            </w:pPr>
+            <w:r>
+              <w:rPr>
+                <w:sz w:val="16"/>
+              </w:rPr>
+              <w:t>8b990e2</w:t>
+            </w:r>
+          </w:p>
+        </w:tc>
+        <w:tc>
+          <w:tcPr>
+            <w:tcW w:w="4706" w:type="dxa"/>
+            <w:vAlign w:val="center"/>
+          </w:tcPr>
+          <w:p>
+            <w:pPr>
+              <w:spacing w:after="0"/>
+            </w:pPr>
+            <w:r>
+              <w:rPr>
+                <w:sz w:val="16"/>
+              </w:rPr>
+              <w:t>docs(lab): update experiment C documentation and final report</w:t>
+            </w:r>
+          </w:p>
+        </w:tc>
+        <w:tc>
+          <w:tcPr>
+            <w:tcW w:w="2835" w:type="dxa"/>
+            <w:vAlign w:val="center"/>
+          </w:tcPr>
+          <w:p>
+            <w:pPr>
+              <w:spacing w:after="0"/>
+            </w:pPr>
+            <w:r>
+              <w:rPr>
+                <w:sz w:val="16"/>
+              </w:rPr>
+              <w:t>Documentación técnica e informe.</w:t>
+            </w:r>
+          </w:p>
+        </w:tc>
+      </w:tr>
+      <w:tr>
+        <w:trPr>
+          <w:jc w:val="center"/>
+        </w:trPr>
+        <w:tc>
+          <w:tcPr>
+            <w:tcW w:w="1077" w:type="dxa"/>
+            <w:vAlign w:val="center"/>
+          </w:tcPr>
+          <w:p>
+            <w:pPr>
+              <w:spacing w:after="0"/>
+            </w:pPr>
+            <w:r>
+              <w:rPr>
+                <w:sz w:val="16"/>
+              </w:rPr>
+              <w:t>5b56bc7</w:t>
+            </w:r>
+          </w:p>
+        </w:tc>
+        <w:tc>
+          <w:tcPr>
+            <w:tcW w:w="4706" w:type="dxa"/>
+            <w:vAlign w:val="center"/>
+          </w:tcPr>
+          <w:p>
+            <w:pPr>
+              <w:spacing w:after="0"/>
+            </w:pPr>
+            <w:r>
+              <w:rPr>
+                <w:sz w:val="16"/>
+              </w:rPr>
+              <w:t>docs(readme): update project overview and experiment results</w:t>
+            </w:r>
+          </w:p>
+        </w:tc>
+        <w:tc>
+          <w:tcPr>
+            <w:tcW w:w="2835" w:type="dxa"/>
+            <w:vAlign w:val="center"/>
+          </w:tcPr>
+          <w:p>
+            <w:pPr>
+              <w:spacing w:after="0"/>
+            </w:pPr>
+            <w:r>
+              <w:rPr>
+                <w:sz w:val="16"/>
+              </w:rPr>
+              <w:t>Actualización del README principal.</w:t>
+            </w:r>
+          </w:p>
+        </w:tc>
+      </w:tr>
+    </w:tbl>
+    <w:p>
+      <w:pPr>
+        <w:spacing w:after="80"/>
+      </w:pPr>
+      <w:r>
+        <w:rPr>
+          <w:sz w:val="18"/>
+        </w:rPr>
+        <w:t>Los commits anteriores incluyen la configuración inicial del repositorio, la incorporación de receptores, los experimentos HTTP/MQTT, los diagramas y las primeras evidencias. Los identificadores y mensajes anteriores permanecen disponibles en el historial público del enlace indicado.</w:t>
       </w:r>
     </w:p>
     <w:p>
@@ -5003,6 +5521,7 @@
         <w:rPr>
           <w:rFonts w:ascii="Arial" w:hAnsi="Arial"/>
         </w:rPr>
+        <w:lastRenderedPageBreak/>
         <w:t>2. ¿Cuándo conviene HTTP y cuándo MQTT?</w:t>
       </w:r>
     </w:p>
@@ -5067,7 +5586,6 @@
         <w:rPr>
           <w:rFonts w:ascii="Arial" w:hAnsi="Arial"/>
         </w:rPr>
-        <w:lastRenderedPageBreak/>
         <w:t>12. Conclusiones técnicas</w:t>
       </w:r>
     </w:p>
@@ -7075,6 +7593,7 @@
               <w:rPr>
                 <w:sz w:val="16"/>
               </w:rPr>
+              <w:lastRenderedPageBreak/>
               <w:t>21</w:t>
             </w:r>
           </w:p>
@@ -8121,7 +8640,6 @@
               <w:rPr>
                 <w:sz w:val="16"/>
               </w:rPr>
-              <w:lastRenderedPageBreak/>
               <w:t>1</w:t>
             </w:r>
           </w:p>
@@ -10858,12 +11376,9 @@
         <w:jc w:val="center"/>
       </w:pPr>
       <w:r>
-        <w:rPr>
-          <w:noProof/>
-        </w:rPr>
         <w:lastRenderedPageBreak/>
         <w:drawing>
-          <wp:inline distT="0" distB="0" distL="0" distR="0" wp14:anchorId="5A8C31F2" wp14:editId="4F650A13">
+          <wp:inline distT="0" distB="0" distL="0" distR="0" wp14:anchorId="3C2642F6" wp14:editId="22E39AF4">
             <wp:extent cx="4644000" cy="3716983"/>
             <wp:effectExtent l="0" t="0" r="0" b="0"/>
             <wp:docPr id="8" name="Picture 8"/>
@@ -10914,11 +11429,8 @@
         <w:jc w:val="center"/>
       </w:pPr>
       <w:r>
-        <w:rPr>
-          <w:noProof/>
-        </w:rPr>
         <w:drawing>
-          <wp:inline distT="0" distB="0" distL="0" distR="0" wp14:anchorId="724049B9" wp14:editId="275941B5">
+          <wp:inline distT="0" distB="0" distL="0" distR="0" wp14:anchorId="10BC5657" wp14:editId="2448F6F6">
             <wp:extent cx="4680000" cy="3326185"/>
             <wp:effectExtent l="0" t="0" r="0" b="0"/>
             <wp:docPr id="9" name="Picture 9"/>
@@ -10969,12 +11481,9 @@
         <w:jc w:val="center"/>
       </w:pPr>
       <w:r>
-        <w:rPr>
-          <w:noProof/>
-        </w:rPr>
         <w:lastRenderedPageBreak/>
         <w:drawing>
-          <wp:inline distT="0" distB="0" distL="0" distR="0" wp14:anchorId="263A8E34" wp14:editId="2F6E2560">
+          <wp:inline distT="0" distB="0" distL="0" distR="0" wp14:anchorId="1E370D6B" wp14:editId="410A7160">
             <wp:extent cx="5040000" cy="2548350"/>
             <wp:effectExtent l="0" t="0" r="0" b="0"/>
             <wp:docPr id="10" name="Picture 10"/>
@@ -11025,11 +11534,8 @@
         <w:jc w:val="center"/>
       </w:pPr>
       <w:r>
-        <w:rPr>
-          <w:noProof/>
-        </w:rPr>
         <w:drawing>
-          <wp:inline distT="0" distB="0" distL="0" distR="0" wp14:anchorId="2F9CAE77" wp14:editId="28DDD5DC">
+          <wp:inline distT="0" distB="0" distL="0" distR="0" wp14:anchorId="48AC4FDC" wp14:editId="1580788D">
             <wp:extent cx="4500000" cy="4737885"/>
             <wp:effectExtent l="0" t="0" r="0" b="0"/>
             <wp:docPr id="11" name="Picture 11"/>
@@ -11080,12 +11586,9 @@
         <w:jc w:val="center"/>
       </w:pPr>
       <w:r>
-        <w:rPr>
-          <w:noProof/>
-        </w:rPr>
         <w:lastRenderedPageBreak/>
         <w:drawing>
-          <wp:inline distT="0" distB="0" distL="0" distR="0" wp14:anchorId="61622F76" wp14:editId="0EC3BA35">
+          <wp:inline distT="0" distB="0" distL="0" distR="0" wp14:anchorId="7C9D7397" wp14:editId="3F6854CD">
             <wp:extent cx="4031999" cy="3808516"/>
             <wp:effectExtent l="0" t="0" r="0" b="0"/>
             <wp:docPr id="12" name="Picture 12"/>
@@ -11136,11 +11639,8 @@
         <w:jc w:val="center"/>
       </w:pPr>
       <w:r>
-        <w:rPr>
-          <w:noProof/>
-        </w:rPr>
         <w:drawing>
-          <wp:inline distT="0" distB="0" distL="0" distR="0" wp14:anchorId="05CB2BCB" wp14:editId="5E5BC87C">
+          <wp:inline distT="0" distB="0" distL="0" distR="0" wp14:anchorId="208A1A83" wp14:editId="6D27C57D">
             <wp:extent cx="4212000" cy="2708894"/>
             <wp:effectExtent l="0" t="0" r="0" b="0"/>
             <wp:docPr id="13" name="Picture 13"/>
@@ -12981,9 +13481,6 @@
       <w:fldChar w:fldCharType="separate"/>
     </w:r>
     <w:r>
-      <w:rPr>
-        <w:noProof/>
-      </w:rPr>
       <w:t>1</w:t>
     </w:r>
     <w:r>
@@ -13209,184 +13706,32 @@
       </w:rPr>
     </w:lvl>
   </w:abstractNum>
-  <w:abstractNum w:abstractNumId="9" w15:restartNumberingAfterBreak="0">
-    <w:nsid w:val="28F44074"/>
-    <w:multiLevelType w:val="multilevel"/>
-    <w:tmpl w:val="E36EB2FE"/>
-    <w:lvl w:ilvl="0">
-      <w:start w:val="1"/>
-      <w:numFmt w:val="bullet"/>
-      <w:lvlText w:val=""/>
-      <w:lvlJc w:val="left"/>
-      <w:pPr>
-        <w:tabs>
-          <w:tab w:val="num" w:pos="720"/>
-        </w:tabs>
-        <w:ind w:left="720" w:hanging="360"/>
-      </w:pPr>
-      <w:rPr>
-        <w:rFonts w:ascii="Symbol" w:hAnsi="Symbol" w:hint="default"/>
-        <w:sz w:val="20"/>
-      </w:rPr>
-    </w:lvl>
-    <w:lvl w:ilvl="1" w:tentative="1">
-      <w:start w:val="1"/>
-      <w:numFmt w:val="bullet"/>
-      <w:lvlText w:val="o"/>
-      <w:lvlJc w:val="left"/>
-      <w:pPr>
-        <w:tabs>
-          <w:tab w:val="num" w:pos="1440"/>
-        </w:tabs>
-        <w:ind w:left="1440" w:hanging="360"/>
-      </w:pPr>
-      <w:rPr>
-        <w:rFonts w:ascii="Courier New" w:hAnsi="Courier New" w:hint="default"/>
-        <w:sz w:val="20"/>
-      </w:rPr>
-    </w:lvl>
-    <w:lvl w:ilvl="2" w:tentative="1">
-      <w:start w:val="1"/>
-      <w:numFmt w:val="bullet"/>
-      <w:lvlText w:val=""/>
-      <w:lvlJc w:val="left"/>
-      <w:pPr>
-        <w:tabs>
-          <w:tab w:val="num" w:pos="2160"/>
-        </w:tabs>
-        <w:ind w:left="2160" w:hanging="360"/>
-      </w:pPr>
-      <w:rPr>
-        <w:rFonts w:ascii="Wingdings" w:hAnsi="Wingdings" w:hint="default"/>
-        <w:sz w:val="20"/>
-      </w:rPr>
-    </w:lvl>
-    <w:lvl w:ilvl="3" w:tentative="1">
-      <w:start w:val="1"/>
-      <w:numFmt w:val="bullet"/>
-      <w:lvlText w:val=""/>
-      <w:lvlJc w:val="left"/>
-      <w:pPr>
-        <w:tabs>
-          <w:tab w:val="num" w:pos="2880"/>
-        </w:tabs>
-        <w:ind w:left="2880" w:hanging="360"/>
-      </w:pPr>
-      <w:rPr>
-        <w:rFonts w:ascii="Wingdings" w:hAnsi="Wingdings" w:hint="default"/>
-        <w:sz w:val="20"/>
-      </w:rPr>
-    </w:lvl>
-    <w:lvl w:ilvl="4" w:tentative="1">
-      <w:start w:val="1"/>
-      <w:numFmt w:val="bullet"/>
-      <w:lvlText w:val=""/>
-      <w:lvlJc w:val="left"/>
-      <w:pPr>
-        <w:tabs>
-          <w:tab w:val="num" w:pos="3600"/>
-        </w:tabs>
-        <w:ind w:left="3600" w:hanging="360"/>
-      </w:pPr>
-      <w:rPr>
-        <w:rFonts w:ascii="Wingdings" w:hAnsi="Wingdings" w:hint="default"/>
-        <w:sz w:val="20"/>
-      </w:rPr>
-    </w:lvl>
-    <w:lvl w:ilvl="5" w:tentative="1">
-      <w:start w:val="1"/>
-      <w:numFmt w:val="bullet"/>
-      <w:lvlText w:val=""/>
-      <w:lvlJc w:val="left"/>
-      <w:pPr>
-        <w:tabs>
-          <w:tab w:val="num" w:pos="4320"/>
-        </w:tabs>
-        <w:ind w:left="4320" w:hanging="360"/>
-      </w:pPr>
-      <w:rPr>
-        <w:rFonts w:ascii="Wingdings" w:hAnsi="Wingdings" w:hint="default"/>
-        <w:sz w:val="20"/>
-      </w:rPr>
-    </w:lvl>
-    <w:lvl w:ilvl="6" w:tentative="1">
-      <w:start w:val="1"/>
-      <w:numFmt w:val="bullet"/>
-      <w:lvlText w:val=""/>
-      <w:lvlJc w:val="left"/>
-      <w:pPr>
-        <w:tabs>
-          <w:tab w:val="num" w:pos="5040"/>
-        </w:tabs>
-        <w:ind w:left="5040" w:hanging="360"/>
-      </w:pPr>
-      <w:rPr>
-        <w:rFonts w:ascii="Wingdings" w:hAnsi="Wingdings" w:hint="default"/>
-        <w:sz w:val="20"/>
-      </w:rPr>
-    </w:lvl>
-    <w:lvl w:ilvl="7" w:tentative="1">
-      <w:start w:val="1"/>
-      <w:numFmt w:val="bullet"/>
-      <w:lvlText w:val=""/>
-      <w:lvlJc w:val="left"/>
-      <w:pPr>
-        <w:tabs>
-          <w:tab w:val="num" w:pos="5760"/>
-        </w:tabs>
-        <w:ind w:left="5760" w:hanging="360"/>
-      </w:pPr>
-      <w:rPr>
-        <w:rFonts w:ascii="Wingdings" w:hAnsi="Wingdings" w:hint="default"/>
-        <w:sz w:val="20"/>
-      </w:rPr>
-    </w:lvl>
-    <w:lvl w:ilvl="8" w:tentative="1">
-      <w:start w:val="1"/>
-      <w:numFmt w:val="bullet"/>
-      <w:lvlText w:val=""/>
-      <w:lvlJc w:val="left"/>
-      <w:pPr>
-        <w:tabs>
-          <w:tab w:val="num" w:pos="6480"/>
-        </w:tabs>
-        <w:ind w:left="6480" w:hanging="360"/>
-      </w:pPr>
-      <w:rPr>
-        <w:rFonts w:ascii="Wingdings" w:hAnsi="Wingdings" w:hint="default"/>
-        <w:sz w:val="20"/>
-      </w:rPr>
-    </w:lvl>
-  </w:abstractNum>
-  <w:num w:numId="1" w16cid:durableId="548423827">
+  <w:num w:numId="1" w16cid:durableId="1806698835">
     <w:abstractNumId w:val="8"/>
   </w:num>
-  <w:num w:numId="2" w16cid:durableId="2091193292">
+  <w:num w:numId="2" w16cid:durableId="526060743">
     <w:abstractNumId w:val="6"/>
   </w:num>
-  <w:num w:numId="3" w16cid:durableId="715154642">
+  <w:num w:numId="3" w16cid:durableId="1274095015">
     <w:abstractNumId w:val="5"/>
   </w:num>
-  <w:num w:numId="4" w16cid:durableId="2064792787">
+  <w:num w:numId="4" w16cid:durableId="1818379507">
     <w:abstractNumId w:val="4"/>
   </w:num>
-  <w:num w:numId="5" w16cid:durableId="772551650">
+  <w:num w:numId="5" w16cid:durableId="653069089">
     <w:abstractNumId w:val="7"/>
   </w:num>
-  <w:num w:numId="6" w16cid:durableId="1496873167">
+  <w:num w:numId="6" w16cid:durableId="1126773568">
     <w:abstractNumId w:val="3"/>
   </w:num>
-  <w:num w:numId="7" w16cid:durableId="2083749575">
+  <w:num w:numId="7" w16cid:durableId="1727803810">
     <w:abstractNumId w:val="2"/>
   </w:num>
-  <w:num w:numId="8" w16cid:durableId="894854644">
+  <w:num w:numId="8" w16cid:durableId="684598646">
     <w:abstractNumId w:val="1"/>
   </w:num>
-  <w:num w:numId="9" w16cid:durableId="453137547">
+  <w:num w:numId="9" w16cid:durableId="305823189">
     <w:abstractNumId w:val="0"/>
-  </w:num>
-  <w:num w:numId="10" w16cid:durableId="690690914">
-    <w:abstractNumId w:val="9"/>
   </w:num>
 </w:numbering>
 </file>
@@ -13786,6 +14131,7 @@
     </w:pPr>
     <w:rPr>
       <w:rFonts w:ascii="Arial" w:hAnsi="Arial"/>
+      <w:noProof/>
       <w:color w:val="000000"/>
       <w:sz w:val="20"/>
       <w:lang w:val="es-PE"/>
@@ -13992,6 +14338,7 @@
   <w:style w:type="character" w:default="1" w:styleId="Fuentedeprrafopredeter">
     <w:name w:val="Default Paragraph Font"/>
     <w:uiPriority w:val="1"/>
+    <w:semiHidden/>
     <w:unhideWhenUsed/>
   </w:style>
   <w:style w:type="table" w:default="1" w:styleId="Tablanormal">
@@ -24810,29 +25157,6 @@
       <w:sz w:val="18"/>
     </w:rPr>
   </w:style>
-  <w:style w:type="character" w:styleId="Hipervnculo">
-    <w:name w:val="Hyperlink"/>
-    <w:basedOn w:val="Fuentedeprrafopredeter"/>
-    <w:uiPriority w:val="99"/>
-    <w:unhideWhenUsed/>
-    <w:rsid w:val="00814696"/>
-    <w:rPr>
-      <w:color w:val="0000FF" w:themeColor="hyperlink"/>
-      <w:u w:val="single"/>
-    </w:rPr>
-  </w:style>
-  <w:style w:type="character" w:styleId="Mencinsinresolver">
-    <w:name w:val="Unresolved Mention"/>
-    <w:basedOn w:val="Fuentedeprrafopredeter"/>
-    <w:uiPriority w:val="99"/>
-    <w:semiHidden/>
-    <w:unhideWhenUsed/>
-    <w:rsid w:val="00814696"/>
-    <w:rPr>
-      <w:color w:val="605E5C"/>
-      <w:shd w:val="clear" w:color="auto" w:fill="E1DFDD"/>
-    </w:rPr>
-  </w:style>
 </w:styles>
 </file>
 

</xml_diff>